<commit_message>
Updated game guides and growth realms
</commit_message>
<xml_diff>
--- a/downloads/resources/takeout-taco-lunch-rush-faculty-guide.docx
+++ b/downloads/resources/takeout-taco-lunch-rush-faculty-guide.docx
@@ -91,6 +91,9 @@
       <w:pPr>
         <w:keepLines/>
       </w:pPr>
+      <w:r>
+        <w:t xml:space="preserve">This game comes from a lecture video I use in my online courses. The food truck is an MS Paint design that was enhanced by AI. </w:t>
+      </w:r>
       <w:r>
         <w:t>In designing Takeout Taco, I wanted students to experience production before I showed them a production function. They begin with a lunch rush and a staffing problem. At first, adding workers helps because tasks can be divided. Eventually the truck gets crowded. When the production record and graphs appear, students can connect them to something they have already seen happen.</w:t>
       </w:r>
@@ -324,42 +327,7 @@
         <w:keepLines/>
       </w:pPr>
       <w:r>
-        <w:t xml:space="preserve">The second truck gives those six workers more room to work. For this challenge, everyone compares with the one-truck baseline of </w:t>
-      </w:r>
-      <w:r>
-        <w:rPr/>
-        <w:t>6 + 0: 53 tacos</w:t>
-      </w:r>
-      <w:r>
-        <w:t xml:space="preserve">, even if their earlier run ended with a smaller crew. Each truck uses the same schedule: </w:t>
-      </w:r>
-      <w:r>
-        <w:rPr/>
-        <w:t>5 + 1 gives 50 + 8 = 58</w:t>
-      </w:r>
-      <w:r>
-        <w:t xml:space="preserve">, </w:t>
-      </w:r>
-      <w:r>
-        <w:rPr/>
-        <w:t>4 + 2 gives 42 + 18 = 60</w:t>
-      </w:r>
-      <w:r>
-        <w:t xml:space="preserve">, and </w:t>
-      </w:r>
-      <w:r>
-        <w:rPr/>
-        <w:t>3 + 3 gives 31 + 31 = 62</w:t>
-      </w:r>
-      <w:r>
-        <w:t xml:space="preserve">. Students can try different splits without having to test them all. With three workers in each kitchen, they get </w:t>
-      </w:r>
-      <w:r>
-        <w:rPr/>
-        <w:t>nine more tacos from the same labor</w:t>
-      </w:r>
-      <w:r>
-        <w:t xml:space="preserve"> by putting more space and equipment at the crew’s disposal.</w:t>
+        <w:t>The second truck gives those six workers more room to work. For this challenge, everyone compares with the one-truck baseline of 6 + 0: 53 tacos, even if their earlier run ended with a smaller crew. Each truck uses the same schedule: 5 + 1 gives 50 + 8 = 58, 4 + 2 gives 42 + 18 = 60, and 3 + 3 gives 31 + 31 = 62. Students can try different splits without having to test them all. With three workers in each kitchen, they get nine more tacos from the same labor by putting more space and equipment at the crew’s disposal.</w:t>
       </w:r>
     </w:p>
     <w:p>
@@ -632,11 +600,7 @@
         </w:numPr>
       </w:pPr>
       <w:r>
-        <w:rPr/>
-        <w:t>“Diminishing returns begins with the second worker.”</w:t>
-      </w:r>
-      <w:r>
-        <w:t xml:space="preserve"> Specialization raises marginal product initially; the first decline occurs with Worker 4.</w:t>
+        <w:t>“Diminishing returns begins with the second worker.” Specialization raises marginal product initially; the first decline occurs with Worker 4.</w:t>
       </w:r>
     </w:p>
     <w:p>
@@ -648,11 +612,7 @@
         </w:numPr>
       </w:pPr>
       <w:r>
-        <w:rPr/>
-        <w:t>“Falling marginal product means falling total product.”</w:t>
-      </w:r>
-      <w:r>
-        <w:t xml:space="preserve"> Positive additions still raise the total, even when those additions become smaller.</w:t>
+        <w:t>“Falling marginal product means falling total product.” Positive additions still raise the total, even when those additions become smaller.</w:t>
       </w:r>
     </w:p>
     <w:p>
@@ -664,11 +624,7 @@
         </w:numPr>
       </w:pPr>
       <w:r>
-        <w:rPr/>
-        <w:t>“Later workers must be less skilled.”</w:t>
-      </w:r>
-      <w:r>
-        <w:t xml:space="preserve"> More labor shares the same fixed kitchen and equipment. Skill differences do not explain this schedule.</w:t>
+        <w:t>“Later workers must be less skilled.” More labor shares the same fixed kitchen and equipment. Skill differences do not explain this schedule.</w:t>
       </w:r>
     </w:p>
     <w:p>
@@ -680,11 +636,7 @@
         </w:numPr>
       </w:pPr>
       <w:r>
-        <w:rPr/>
-        <w:t>“Crowding means demand fell.”</w:t>
-      </w:r>
-      <w:r>
-        <w:t xml:space="preserve"> Demand remains strong. The constraint is inside the truck’s production space.</w:t>
+        <w:t>“Crowding means demand fell.” Demand remains strong. The constraint is inside the truck’s production space.</w:t>
       </w:r>
     </w:p>
     <w:p>
@@ -696,11 +648,7 @@
         </w:numPr>
       </w:pPr>
       <w:r>
-        <w:rPr/>
-        <w:t>“The sixth worker contributes nothing.”</w:t>
-      </w:r>
-      <w:r>
-        <w:t xml:space="preserve"> Output rises from 50 to 53; the contribution is small and positive.</w:t>
+        <w:t>“The sixth worker contributes nothing.” Output rises from 50 to 53; the contribution is small and positive.</w:t>
       </w:r>
     </w:p>
     <w:p>
@@ -712,11 +660,7 @@
         </w:numPr>
       </w:pPr>
       <w:r>
-        <w:rPr/>
-        <w:t>“A second truck disproves diminishing marginal returns.”</w:t>
-      </w:r>
-      <w:r>
-        <w:t xml:space="preserve"> Additional capital changes the fixed-input condition. The original one-truck relationship describes a different setup.</w:t>
+        <w:t>“A second truck disproves diminishing marginal returns.” Additional capital changes the fixed-input condition. The original one-truck relationship describes a different setup.</w:t>
       </w:r>
     </w:p>
     <w:sectPr>

</xml_diff>